<commit_message>
Update README with Quick Setup and cross-platform instructions
</commit_message>
<xml_diff>
--- a/imports/outbreak_ve_demo/docx/01_vaccine_effectiveness_outbreak.docx
+++ b/imports/outbreak_ve_demo/docx/01_vaccine_effectiveness_outbreak.docx
@@ -511,91 +511,50 @@
         <w:rPr>
           <w:rFonts w:ascii="Calibri" w:hAnsi="Calibri" w:cs="Calibri"/>
         </w:rPr>
+        <w:t>Callout :</w:t>
+      </w:r>
+      <w:proofErr w:type="gramEnd"/>
+      <w:r>
+        <w:rPr>
+          <w:rFonts w:ascii="Calibri" w:hAnsi="Calibri" w:cs="Calibri"/>
+        </w:rPr>
+        <w:t>: important</w:t>
+      </w:r>
+    </w:p>
+    <w:p>
+      <w:pPr>
+        <w:rPr>
+          <w:rFonts w:ascii="Calibri" w:hAnsi="Calibri" w:cs="Calibri"/>
+        </w:rPr>
+      </w:pPr>
+      <w:r>
+        <w:rPr>
+          <w:rFonts w:ascii="Calibri" w:hAnsi="Calibri" w:cs="Calibri"/>
+        </w:rPr>
         <w:lastRenderedPageBreak/>
-        <w:t>Callout :</w:t>
+        <w:br/>
+      </w:r>
+      <w:proofErr w:type="gramStart"/>
+      <w:r>
+        <w:rPr>
+          <w:rFonts w:ascii="Calibri" w:hAnsi="Calibri" w:cs="Calibri"/>
+        </w:rPr>
+        <w:t>Text :</w:t>
       </w:r>
       <w:proofErr w:type="gramEnd"/>
       <w:r>
         <w:rPr>
           <w:rFonts w:ascii="Calibri" w:hAnsi="Calibri" w:cs="Calibri"/>
         </w:rPr>
-        <w:t>: important</w:t>
-      </w:r>
-      <w:r>
-        <w:rPr>
-          <w:rFonts w:ascii="Calibri" w:hAnsi="Calibri" w:cs="Calibri"/>
-        </w:rPr>
-        <w:br/>
-        <w:t>Text :: Vaccine effectiveness measures the reduction in disease risk among vaccinated individuals compared to unvaccinated individuals in real-world conditions.</w:t>
-      </w:r>
-    </w:p>
-    <w:p>
-      <w:pPr>
-        <w:rPr>
-          <w:rFonts w:ascii="Calibri" w:hAnsi="Calibri" w:cs="Calibri"/>
-        </w:rPr>
-      </w:pPr>
-    </w:p>
-    <w:p>
-      <w:pPr>
-        <w:pStyle w:val="Heading2"/>
-        <w:rPr>
-          <w:rFonts w:ascii="Calibri" w:hAnsi="Calibri" w:cs="Calibri"/>
-        </w:rPr>
-      </w:pPr>
-      <w:r>
-        <w:rPr>
-          <w:rFonts w:ascii="Calibri" w:hAnsi="Calibri" w:cs="Calibri"/>
-        </w:rPr>
-        <w:t>Definition</w:t>
-      </w:r>
-    </w:p>
-    <w:p>
-      <w:pPr>
-        <w:rPr>
-          <w:rFonts w:ascii="Calibri" w:hAnsi="Calibri" w:cs="Calibri"/>
-        </w:rPr>
-      </w:pPr>
-    </w:p>
-    <w:p>
-      <w:pPr>
-        <w:rPr>
-          <w:rFonts w:ascii="Calibri" w:hAnsi="Calibri" w:cs="Calibri"/>
-        </w:rPr>
-      </w:pPr>
-      <w:r>
-        <w:rPr>
-          <w:rFonts w:ascii="Calibri" w:hAnsi="Calibri" w:cs="Calibri"/>
-        </w:rPr>
-        <w:t>Definition</w:t>
-      </w:r>
-      <w:r>
-        <w:rPr>
-          <w:rFonts w:ascii="Calibri" w:hAnsi="Calibri" w:cs="Calibri"/>
-        </w:rPr>
-        <w:br/>
-      </w:r>
-      <w:proofErr w:type="gramStart"/>
-      <w:r>
-        <w:rPr>
-          <w:rFonts w:ascii="Calibri" w:hAnsi="Calibri" w:cs="Calibri"/>
-        </w:rPr>
-        <w:t>Term :</w:t>
-      </w:r>
-      <w:proofErr w:type="gramEnd"/>
-      <w:r>
-        <w:rPr>
-          <w:rFonts w:ascii="Calibri" w:hAnsi="Calibri" w:cs="Calibri"/>
-        </w:rPr>
-        <w:t>: Relative Risk</w:t>
-      </w:r>
-      <w:r>
-        <w:rPr>
-          <w:rFonts w:ascii="Calibri" w:hAnsi="Calibri" w:cs="Calibri"/>
-        </w:rPr>
-        <w:br/>
-        <w:t>Meaning :: The ratio of the probability of disease occurring in the vaccinated group compared to the unvaccinated group.</w:t>
-      </w:r>
+        <w:t>: Vaccine effectiveness measures the reduction in disease risk among vaccinated individuals compared to unvaccinated individuals in real-world conditions.</w:t>
+      </w:r>
+    </w:p>
+    <w:p>
+      <w:pPr>
+        <w:rPr>
+          <w:rFonts w:ascii="Calibri" w:hAnsi="Calibri" w:cs="Calibri"/>
+        </w:rPr>
+      </w:pPr>
     </w:p>
     <w:p>
       <w:pPr>
@@ -1086,6 +1045,111 @@
     <w:p>
       <w:pPr>
         <w:pStyle w:val="Heading2"/>
+      </w:pPr>
+      <w:r>
+        <w:t>Youtube</w:t>
+      </w:r>
+    </w:p>
+    <w:p>
+      <w:pPr>
+        <w:rPr>
+          <w:rFonts w:ascii="Calibri" w:hAnsi="Calibri" w:cs="Calibri"/>
+        </w:rPr>
+      </w:pPr>
+      <w:proofErr w:type="spellStart"/>
+      <w:proofErr w:type="gramStart"/>
+      <w:r>
+        <w:rPr>
+          <w:rFonts w:ascii="Calibri" w:hAnsi="Calibri" w:cs="Calibri"/>
+        </w:rPr>
+        <w:t>YouTubeEmbed</w:t>
+      </w:r>
+      <w:proofErr w:type="spellEnd"/>
+      <w:r>
+        <w:rPr>
+          <w:rFonts w:ascii="Calibri" w:hAnsi="Calibri" w:cs="Calibri"/>
+        </w:rPr>
+        <w:t xml:space="preserve"> :</w:t>
+      </w:r>
+      <w:proofErr w:type="gramEnd"/>
+      <w:r>
+        <w:rPr>
+          <w:rFonts w:ascii="Calibri" w:hAnsi="Calibri" w:cs="Calibri"/>
+        </w:rPr>
+        <w:t>: https://www.youtube.com/watch?v=yt3e8Ng0mf0</w:t>
+      </w:r>
+    </w:p>
+    <w:p>
+      <w:pPr>
+        <w:rPr>
+          <w:rFonts w:ascii="Calibri" w:hAnsi="Calibri" w:cs="Calibri"/>
+        </w:rPr>
+      </w:pPr>
+    </w:p>
+    <w:p>
+      <w:pPr>
+        <w:rPr>
+          <w:rFonts w:ascii="Calibri" w:hAnsi="Calibri" w:cs="Calibri"/>
+        </w:rPr>
+      </w:pPr>
+    </w:p>
+    <w:p>
+      <w:pPr>
+        <w:rPr>
+          <w:rFonts w:ascii="Calibri" w:hAnsi="Calibri" w:cs="Calibri"/>
+        </w:rPr>
+      </w:pPr>
+    </w:p>
+    <w:p>
+      <w:pPr>
+        <w:pStyle w:val="Heading2"/>
+      </w:pPr>
+      <w:r>
+        <w:lastRenderedPageBreak/>
+        <w:t>Panopto</w:t>
+      </w:r>
+    </w:p>
+    <w:p>
+      <w:pPr>
+        <w:rPr>
+          <w:rFonts w:ascii="Calibri" w:hAnsi="Calibri" w:cs="Calibri"/>
+        </w:rPr>
+      </w:pPr>
+      <w:proofErr w:type="spellStart"/>
+      <w:proofErr w:type="gramStart"/>
+      <w:r>
+        <w:rPr>
+          <w:rFonts w:ascii="Calibri" w:hAnsi="Calibri" w:cs="Calibri"/>
+        </w:rPr>
+        <w:t>PanoptoEmbed</w:t>
+      </w:r>
+      <w:proofErr w:type="spellEnd"/>
+      <w:r>
+        <w:rPr>
+          <w:rFonts w:ascii="Calibri" w:hAnsi="Calibri" w:cs="Calibri"/>
+        </w:rPr>
+        <w:t xml:space="preserve"> :</w:t>
+      </w:r>
+      <w:proofErr w:type="gramEnd"/>
+      <w:r>
+        <w:rPr>
+          <w:rFonts w:ascii="Calibri" w:hAnsi="Calibri" w:cs="Calibri"/>
+        </w:rPr>
+        <w:t>:</w:t>
+      </w:r>
+      <w:r>
+        <w:t xml:space="preserve"> </w:t>
+      </w:r>
+      <w:r>
+        <w:rPr>
+          <w:rFonts w:ascii="Calibri" w:hAnsi="Calibri" w:cs="Calibri"/>
+        </w:rPr>
+        <w:t>https://lshtm.cloud.panopto.eu/Panopto/Pages/Viewer.aspx?id=d19ba573-9ad1-480b-95db-b3ed01014aab</w:t>
+      </w:r>
+    </w:p>
+    <w:p>
+      <w:pPr>
+        <w:pStyle w:val="Heading2"/>
         <w:rPr>
           <w:rFonts w:ascii="Calibri" w:hAnsi="Calibri" w:cs="Calibri"/>
         </w:rPr>
@@ -1542,7 +1606,181 @@
         <w:rPr>
           <w:rFonts w:ascii="Calibri" w:hAnsi="Calibri" w:cs="Calibri"/>
         </w:rPr>
-        <w:lastRenderedPageBreak/>
+        <w:t>Quiz</w:t>
+      </w:r>
+    </w:p>
+    <w:p>
+      <w:pPr>
+        <w:rPr>
+          <w:rFonts w:ascii="Calibri" w:hAnsi="Calibri" w:cs="Calibri"/>
+        </w:rPr>
+      </w:pPr>
+      <w:r>
+        <w:rPr>
+          <w:rFonts w:ascii="Calibri" w:hAnsi="Calibri" w:cs="Calibri"/>
+        </w:rPr>
+        <w:br/>
+      </w:r>
+      <w:proofErr w:type="gramStart"/>
+      <w:r>
+        <w:rPr>
+          <w:rFonts w:ascii="Calibri" w:hAnsi="Calibri" w:cs="Calibri"/>
+        </w:rPr>
+        <w:t>Question :</w:t>
+      </w:r>
+      <w:proofErr w:type="gramEnd"/>
+      <w:r>
+        <w:rPr>
+          <w:rFonts w:ascii="Calibri" w:hAnsi="Calibri" w:cs="Calibri"/>
+        </w:rPr>
+        <w:t>: Based on the outbreak data, what does a vaccine effectiveness of 80% mean in practice?</w:t>
+      </w:r>
+    </w:p>
+    <w:p>
+      <w:pPr>
+        <w:rPr>
+          <w:rFonts w:ascii="Calibri" w:hAnsi="Calibri" w:cs="Calibri"/>
+        </w:rPr>
+      </w:pPr>
+      <w:proofErr w:type="gramStart"/>
+      <w:r>
+        <w:rPr>
+          <w:rFonts w:ascii="Calibri" w:hAnsi="Calibri" w:cs="Calibri"/>
+        </w:rPr>
+        <w:t>Option :</w:t>
+      </w:r>
+      <w:proofErr w:type="gramEnd"/>
+      <w:r>
+        <w:rPr>
+          <w:rFonts w:ascii="Calibri" w:hAnsi="Calibri" w:cs="Calibri"/>
+        </w:rPr>
+        <w:t>: Vaccinated individuals have zero risk of infection</w:t>
+      </w:r>
+    </w:p>
+    <w:p>
+      <w:pPr>
+        <w:rPr>
+          <w:rFonts w:ascii="Calibri" w:hAnsi="Calibri" w:cs="Calibri"/>
+        </w:rPr>
+      </w:pPr>
+      <w:proofErr w:type="gramStart"/>
+      <w:r>
+        <w:rPr>
+          <w:rFonts w:ascii="Calibri" w:hAnsi="Calibri" w:cs="Calibri"/>
+        </w:rPr>
+        <w:t>Option :</w:t>
+      </w:r>
+      <w:proofErr w:type="gramEnd"/>
+      <w:r>
+        <w:rPr>
+          <w:rFonts w:ascii="Calibri" w:hAnsi="Calibri" w:cs="Calibri"/>
+        </w:rPr>
+        <w:t>: Vaccinated individuals have an 80% lower risk of infection than unvaccinated individuals</w:t>
+      </w:r>
+    </w:p>
+    <w:p>
+      <w:pPr>
+        <w:rPr>
+          <w:rFonts w:ascii="Calibri" w:hAnsi="Calibri" w:cs="Calibri"/>
+        </w:rPr>
+      </w:pPr>
+      <w:proofErr w:type="gramStart"/>
+      <w:r>
+        <w:rPr>
+          <w:rFonts w:ascii="Calibri" w:hAnsi="Calibri" w:cs="Calibri"/>
+        </w:rPr>
+        <w:t>Option :</w:t>
+      </w:r>
+      <w:proofErr w:type="gramEnd"/>
+      <w:r>
+        <w:rPr>
+          <w:rFonts w:ascii="Calibri" w:hAnsi="Calibri" w:cs="Calibri"/>
+        </w:rPr>
+        <w:t>: 80% of vaccinated individuals will not become infected</w:t>
+      </w:r>
+    </w:p>
+    <w:p>
+      <w:pPr>
+        <w:rPr>
+          <w:rFonts w:ascii="Calibri" w:hAnsi="Calibri" w:cs="Calibri"/>
+        </w:rPr>
+      </w:pPr>
+      <w:proofErr w:type="gramStart"/>
+      <w:r>
+        <w:rPr>
+          <w:rFonts w:ascii="Calibri" w:hAnsi="Calibri" w:cs="Calibri"/>
+        </w:rPr>
+        <w:t>Option :</w:t>
+      </w:r>
+      <w:proofErr w:type="gramEnd"/>
+      <w:r>
+        <w:rPr>
+          <w:rFonts w:ascii="Calibri" w:hAnsi="Calibri" w:cs="Calibri"/>
+        </w:rPr>
+        <w:t>: The vaccine prevents 80 cases in every outbreak regardless of context</w:t>
+      </w:r>
+    </w:p>
+    <w:p>
+      <w:pPr>
+        <w:rPr>
+          <w:rFonts w:ascii="Calibri" w:hAnsi="Calibri" w:cs="Calibri"/>
+        </w:rPr>
+      </w:pPr>
+      <w:proofErr w:type="gramStart"/>
+      <w:r>
+        <w:rPr>
+          <w:rFonts w:ascii="Calibri" w:hAnsi="Calibri" w:cs="Calibri"/>
+        </w:rPr>
+        <w:t>Answer :</w:t>
+      </w:r>
+      <w:proofErr w:type="gramEnd"/>
+      <w:r>
+        <w:rPr>
+          <w:rFonts w:ascii="Calibri" w:hAnsi="Calibri" w:cs="Calibri"/>
+        </w:rPr>
+        <w:t>: Vaccinated individuals have an 80% lower risk of infection than unvaccinated individuals</w:t>
+      </w:r>
+    </w:p>
+    <w:p>
+      <w:pPr>
+        <w:rPr>
+          <w:rFonts w:ascii="Calibri" w:hAnsi="Calibri" w:cs="Calibri"/>
+        </w:rPr>
+      </w:pPr>
+      <w:proofErr w:type="gramStart"/>
+      <w:r>
+        <w:rPr>
+          <w:rFonts w:ascii="Calibri" w:hAnsi="Calibri" w:cs="Calibri"/>
+        </w:rPr>
+        <w:t>Explanation :</w:t>
+      </w:r>
+      <w:proofErr w:type="gramEnd"/>
+      <w:r>
+        <w:rPr>
+          <w:rFonts w:ascii="Calibri" w:hAnsi="Calibri" w:cs="Calibri"/>
+        </w:rPr>
+        <w:t>: Vaccine effectiveness compares the risk of disease in vaccinated and unvaccinated groups under real-world conditions. An 80% VE means the vaccinated group experienced substantially lower risk, not that infection risk was eliminated entirely.</w:t>
+      </w:r>
+    </w:p>
+    <w:p>
+      <w:pPr>
+        <w:pStyle w:val="Heading2"/>
+        <w:rPr>
+          <w:rFonts w:ascii="Calibri" w:hAnsi="Calibri" w:cs="Calibri"/>
+        </w:rPr>
+      </w:pPr>
+    </w:p>
+    <w:p>
+      <w:pPr>
+        <w:pStyle w:val="Heading2"/>
+        <w:rPr>
+          <w:rFonts w:ascii="Calibri" w:hAnsi="Calibri" w:cs="Calibri"/>
+        </w:rPr>
+      </w:pPr>
+      <w:r>
+        <w:rPr>
+          <w:rFonts w:ascii="Calibri" w:hAnsi="Calibri" w:cs="Calibri"/>
+        </w:rPr>
         <w:t>Key Takeaway</w:t>
       </w:r>
     </w:p>
@@ -1608,25 +1846,12 @@
           <w:rFonts w:ascii="Calibri" w:hAnsi="Calibri" w:cs="Calibri"/>
         </w:rPr>
       </w:pPr>
-    </w:p>
-    <w:p>
-      <w:pPr>
-        <w:rPr>
-          <w:rFonts w:ascii="Calibri" w:hAnsi="Calibri" w:cs="Calibri"/>
-        </w:rPr>
-      </w:pPr>
-      <w:r>
-        <w:rPr>
-          <w:rFonts w:ascii="Calibri" w:hAnsi="Calibri" w:cs="Calibri"/>
-        </w:rPr>
-        <w:t>References</w:t>
-      </w:r>
       <w:r>
         <w:rPr>
           <w:rFonts w:ascii="Calibri" w:hAnsi="Calibri" w:cs="Calibri"/>
         </w:rPr>
         <w:br/>
-        <w:t xml:space="preserve">WHO Measles Fact Sheet :: </w:t>
+        <w:t xml:space="preserve">WHO Measles Fact Sheet : </w:t>
       </w:r>
       <w:hyperlink r:id="rId8" w:tgtFrame="_new" w:history="1">
         <w:r>
@@ -1642,7 +1867,7 @@
           <w:rFonts w:ascii="Calibri" w:hAnsi="Calibri" w:cs="Calibri"/>
         </w:rPr>
         <w:br/>
-        <w:t xml:space="preserve">Vaccine Effectiveness Overview :: </w:t>
+        <w:t xml:space="preserve">Vaccine Effectiveness Overview : </w:t>
       </w:r>
       <w:hyperlink r:id="rId9" w:tgtFrame="_new" w:history="1">
         <w:r>
@@ -1658,7 +1883,7 @@
           <w:rFonts w:ascii="Calibri" w:hAnsi="Calibri" w:cs="Calibri"/>
         </w:rPr>
         <w:br/>
-        <w:t xml:space="preserve">Measles Vaccine Impact Study :: </w:t>
+        <w:t xml:space="preserve">Measles Vaccine Impact Study : </w:t>
       </w:r>
       <w:hyperlink r:id="rId10" w:tgtFrame="_new" w:history="1">
         <w:r>
@@ -3207,7 +3432,6 @@
   <w:style w:type="character" w:default="1" w:styleId="DefaultParagraphFont">
     <w:name w:val="Default Paragraph Font"/>
     <w:uiPriority w:val="1"/>
-    <w:semiHidden/>
     <w:unhideWhenUsed/>
   </w:style>
   <w:style w:type="table" w:default="1" w:styleId="TableNormal">

</xml_diff>

<commit_message>
Docs: add R Code/R Example authoring guidance and setup instructions
</commit_message>
<xml_diff>
--- a/imports/outbreak_ve_demo/docx/01_vaccine_effectiveness_outbreak.docx
+++ b/imports/outbreak_ve_demo/docx/01_vaccine_effectiveness_outbreak.docx
@@ -1180,11 +1180,278 @@
         </w:rPr>
         <w:t>R Code</w:t>
       </w:r>
-      <w:r>
-        <w:rPr>
-          <w:rFonts w:ascii="Calibri" w:hAnsi="Calibri" w:cs="Calibri"/>
-        </w:rPr>
-        <w:br/>
+    </w:p>
+    <w:p>
+      <w:pPr>
+        <w:rPr>
+          <w:rFonts w:ascii="Calibri" w:hAnsi="Calibri" w:cs="Calibri"/>
+        </w:rPr>
+      </w:pPr>
+      <w:proofErr w:type="gramStart"/>
+      <w:r>
+        <w:rPr>
+          <w:rFonts w:ascii="Calibri" w:hAnsi="Calibri" w:cs="Calibri"/>
+        </w:rPr>
+        <w:t>Alt :</w:t>
+      </w:r>
+      <w:proofErr w:type="gramEnd"/>
+      <w:r>
+        <w:rPr>
+          <w:rFonts w:ascii="Calibri" w:hAnsi="Calibri" w:cs="Calibri"/>
+        </w:rPr>
+        <w:t>: Bar chart showing risk of infection for vaccinated and unvaccinated groups.</w:t>
+      </w:r>
+    </w:p>
+    <w:p>
+      <w:pPr>
+        <w:rPr>
+          <w:rFonts w:ascii="Calibri" w:hAnsi="Calibri" w:cs="Calibri"/>
+        </w:rPr>
+      </w:pPr>
+      <w:proofErr w:type="gramStart"/>
+      <w:r>
+        <w:rPr>
+          <w:rFonts w:ascii="Calibri" w:hAnsi="Calibri" w:cs="Calibri"/>
+        </w:rPr>
+        <w:t>Caption :</w:t>
+      </w:r>
+      <w:proofErr w:type="gramEnd"/>
+      <w:r>
+        <w:rPr>
+          <w:rFonts w:ascii="Calibri" w:hAnsi="Calibri" w:cs="Calibri"/>
+        </w:rPr>
+        <w:t>: Risk of Infection by Vaccination Status</w:t>
+      </w:r>
+    </w:p>
+    <w:p>
+      <w:pPr>
+        <w:rPr>
+          <w:rFonts w:ascii="Calibri" w:hAnsi="Calibri" w:cs="Calibri"/>
+        </w:rPr>
+      </w:pPr>
+    </w:p>
+    <w:p>
+      <w:pPr>
+        <w:rPr>
+          <w:rFonts w:ascii="Calibri" w:hAnsi="Calibri" w:cs="Calibri"/>
+        </w:rPr>
+      </w:pPr>
+      <w:r>
+        <w:rPr>
+          <w:rFonts w:ascii="Calibri" w:hAnsi="Calibri" w:cs="Calibri"/>
+        </w:rPr>
+        <w:t xml:space="preserve">group &lt;- </w:t>
+      </w:r>
+      <w:proofErr w:type="gramStart"/>
+      <w:r>
+        <w:rPr>
+          <w:rFonts w:ascii="Calibri" w:hAnsi="Calibri" w:cs="Calibri"/>
+        </w:rPr>
+        <w:t>c(</w:t>
+      </w:r>
+      <w:proofErr w:type="gramEnd"/>
+      <w:r>
+        <w:rPr>
+          <w:rFonts w:ascii="Calibri" w:hAnsi="Calibri" w:cs="Calibri"/>
+        </w:rPr>
+        <w:t>"Vaccinated", "Unvaccinated")</w:t>
+      </w:r>
+    </w:p>
+    <w:p>
+      <w:pPr>
+        <w:rPr>
+          <w:rFonts w:ascii="Calibri" w:hAnsi="Calibri" w:cs="Calibri"/>
+        </w:rPr>
+      </w:pPr>
+      <w:r>
+        <w:rPr>
+          <w:rFonts w:ascii="Calibri" w:hAnsi="Calibri" w:cs="Calibri"/>
+        </w:rPr>
+        <w:t xml:space="preserve">cases &lt;- </w:t>
+      </w:r>
+      <w:proofErr w:type="gramStart"/>
+      <w:r>
+        <w:rPr>
+          <w:rFonts w:ascii="Calibri" w:hAnsi="Calibri" w:cs="Calibri"/>
+        </w:rPr>
+        <w:t>c(</w:t>
+      </w:r>
+      <w:proofErr w:type="gramEnd"/>
+      <w:r>
+        <w:rPr>
+          <w:rFonts w:ascii="Calibri" w:hAnsi="Calibri" w:cs="Calibri"/>
+        </w:rPr>
+        <w:t>5, 25)</w:t>
+      </w:r>
+    </w:p>
+    <w:p>
+      <w:pPr>
+        <w:rPr>
+          <w:rFonts w:ascii="Calibri" w:hAnsi="Calibri" w:cs="Calibri"/>
+        </w:rPr>
+      </w:pPr>
+      <w:r>
+        <w:rPr>
+          <w:rFonts w:ascii="Calibri" w:hAnsi="Calibri" w:cs="Calibri"/>
+        </w:rPr>
+        <w:t xml:space="preserve">population &lt;- </w:t>
+      </w:r>
+      <w:proofErr w:type="gramStart"/>
+      <w:r>
+        <w:rPr>
+          <w:rFonts w:ascii="Calibri" w:hAnsi="Calibri" w:cs="Calibri"/>
+        </w:rPr>
+        <w:t>c(</w:t>
+      </w:r>
+      <w:proofErr w:type="gramEnd"/>
+      <w:r>
+        <w:rPr>
+          <w:rFonts w:ascii="Calibri" w:hAnsi="Calibri" w:cs="Calibri"/>
+        </w:rPr>
+        <w:t>500, 500)</w:t>
+      </w:r>
+    </w:p>
+    <w:p>
+      <w:pPr>
+        <w:rPr>
+          <w:rFonts w:ascii="Calibri" w:hAnsi="Calibri" w:cs="Calibri"/>
+        </w:rPr>
+      </w:pPr>
+      <w:r>
+        <w:rPr>
+          <w:rFonts w:ascii="Calibri" w:hAnsi="Calibri" w:cs="Calibri"/>
+        </w:rPr>
+        <w:t>risk &lt;- cases / population</w:t>
+      </w:r>
+    </w:p>
+    <w:p>
+      <w:pPr>
+        <w:rPr>
+          <w:rFonts w:ascii="Calibri" w:hAnsi="Calibri" w:cs="Calibri"/>
+        </w:rPr>
+      </w:pPr>
+      <w:proofErr w:type="spellStart"/>
+      <w:proofErr w:type="gramStart"/>
+      <w:r>
+        <w:rPr>
+          <w:rFonts w:ascii="Calibri" w:hAnsi="Calibri" w:cs="Calibri"/>
+        </w:rPr>
+        <w:t>barplot</w:t>
+      </w:r>
+      <w:proofErr w:type="spellEnd"/>
+      <w:r>
+        <w:rPr>
+          <w:rFonts w:ascii="Calibri" w:hAnsi="Calibri" w:cs="Calibri"/>
+        </w:rPr>
+        <w:t>(</w:t>
+      </w:r>
+      <w:proofErr w:type="gramEnd"/>
+      <w:r>
+        <w:rPr>
+          <w:rFonts w:ascii="Calibri" w:hAnsi="Calibri" w:cs="Calibri"/>
+        </w:rPr>
+        <w:t xml:space="preserve">risk, </w:t>
+      </w:r>
+      <w:proofErr w:type="spellStart"/>
+      <w:r>
+        <w:rPr>
+          <w:rFonts w:ascii="Calibri" w:hAnsi="Calibri" w:cs="Calibri"/>
+        </w:rPr>
+        <w:t>names.arg</w:t>
+      </w:r>
+      <w:proofErr w:type="spellEnd"/>
+      <w:r>
+        <w:rPr>
+          <w:rFonts w:ascii="Calibri" w:hAnsi="Calibri" w:cs="Calibri"/>
+        </w:rPr>
+        <w:t xml:space="preserve"> = group, col = c("</w:t>
+      </w:r>
+      <w:proofErr w:type="spellStart"/>
+      <w:r>
+        <w:rPr>
+          <w:rFonts w:ascii="Calibri" w:hAnsi="Calibri" w:cs="Calibri"/>
+        </w:rPr>
+        <w:t>steelblue</w:t>
+      </w:r>
+      <w:proofErr w:type="spellEnd"/>
+      <w:r>
+        <w:rPr>
+          <w:rFonts w:ascii="Calibri" w:hAnsi="Calibri" w:cs="Calibri"/>
+        </w:rPr>
+        <w:t>", "tomato"),</w:t>
+      </w:r>
+    </w:p>
+    <w:p>
+      <w:pPr>
+        <w:rPr>
+          <w:rFonts w:ascii="Calibri" w:hAnsi="Calibri" w:cs="Calibri"/>
+        </w:rPr>
+      </w:pPr>
+      <w:r>
+        <w:rPr>
+          <w:rFonts w:ascii="Calibri" w:hAnsi="Calibri" w:cs="Calibri"/>
+        </w:rPr>
+        <w:t>main = "Risk of Infection by Vaccination Status")</w:t>
+      </w:r>
+    </w:p>
+    <w:p>
+      <w:pPr>
+        <w:rPr>
+          <w:rFonts w:ascii="Calibri" w:hAnsi="Calibri" w:cs="Calibri"/>
+        </w:rPr>
+      </w:pPr>
+    </w:p>
+    <w:p>
+      <w:pPr>
+        <w:rPr>
+          <w:rFonts w:ascii="Calibri" w:hAnsi="Calibri" w:cs="Calibri"/>
+        </w:rPr>
+      </w:pPr>
+      <w:r>
+        <w:rPr>
+          <w:rFonts w:ascii="Calibri" w:hAnsi="Calibri" w:cs="Calibri"/>
+        </w:rPr>
+        <w:t>END R Code</w:t>
+      </w:r>
+    </w:p>
+    <w:p>
+      <w:pPr>
+        <w:rPr>
+          <w:rFonts w:ascii="Calibri" w:hAnsi="Calibri" w:cs="Calibri"/>
+        </w:rPr>
+      </w:pPr>
+    </w:p>
+    <w:p>
+      <w:pPr>
+        <w:pStyle w:val="Heading2"/>
+      </w:pPr>
+      <w:r>
+        <w:t>R Code Only</w:t>
+      </w:r>
+    </w:p>
+    <w:p>
+      <w:pPr>
+        <w:rPr>
+          <w:rFonts w:ascii="Calibri" w:hAnsi="Calibri" w:cs="Calibri"/>
+        </w:rPr>
+      </w:pPr>
+      <w:r>
+        <w:rPr>
+          <w:rFonts w:ascii="Calibri" w:hAnsi="Calibri" w:cs="Calibri"/>
+        </w:rPr>
+        <w:t>R Example</w:t>
+      </w:r>
+    </w:p>
+    <w:p>
+      <w:pPr>
+        <w:rPr>
+          <w:rFonts w:ascii="Calibri" w:hAnsi="Calibri" w:cs="Calibri"/>
+        </w:rPr>
+      </w:pPr>
+      <w:r>
+        <w:rPr>
+          <w:rFonts w:ascii="Calibri" w:hAnsi="Calibri" w:cs="Calibri"/>
+        </w:rPr>
         <w:t xml:space="preserve">group &lt;- </w:t>
       </w:r>
       <w:proofErr w:type="gramStart"/>
@@ -1215,28 +1482,20 @@
         <w:br/>
         <w:t>population &lt;- c(500, 500)</w:t>
       </w:r>
-    </w:p>
-    <w:p>
-      <w:pPr>
-        <w:rPr>
-          <w:rFonts w:ascii="Calibri" w:hAnsi="Calibri" w:cs="Calibri"/>
-        </w:rPr>
-      </w:pPr>
-      <w:r>
-        <w:rPr>
-          <w:rFonts w:ascii="Calibri" w:hAnsi="Calibri" w:cs="Calibri"/>
-        </w:rPr>
+      <w:r>
+        <w:rPr>
+          <w:rFonts w:ascii="Calibri" w:hAnsi="Calibri" w:cs="Calibri"/>
+        </w:rPr>
+        <w:br/>
         <w:t>risk &lt;- cases / population</w:t>
       </w:r>
-    </w:p>
-    <w:p>
-      <w:pPr>
-        <w:rPr>
-          <w:rFonts w:ascii="Calibri" w:hAnsi="Calibri" w:cs="Calibri"/>
-        </w:rPr>
-      </w:pPr>
+      <w:r>
+        <w:rPr>
+          <w:rFonts w:ascii="Calibri" w:hAnsi="Calibri" w:cs="Calibri"/>
+        </w:rPr>
+        <w:br/>
+      </w:r>
       <w:proofErr w:type="spellStart"/>
-      <w:proofErr w:type="gramStart"/>
       <w:r>
         <w:rPr>
           <w:rFonts w:ascii="Calibri" w:hAnsi="Calibri" w:cs="Calibri"/>
@@ -1248,14 +1507,7 @@
         <w:rPr>
           <w:rFonts w:ascii="Calibri" w:hAnsi="Calibri" w:cs="Calibri"/>
         </w:rPr>
-        <w:t>(</w:t>
-      </w:r>
-      <w:proofErr w:type="gramEnd"/>
-      <w:r>
-        <w:rPr>
-          <w:rFonts w:ascii="Calibri" w:hAnsi="Calibri" w:cs="Calibri"/>
-        </w:rPr>
-        <w:t xml:space="preserve">risk, </w:t>
+        <w:t xml:space="preserve">(risk, </w:t>
       </w:r>
       <w:proofErr w:type="spellStart"/>
       <w:r>
@@ -1292,6 +1544,25 @@
         <w:br/>
         <w:t>main = "Risk of Infection by Vaccination Status")</w:t>
       </w:r>
+      <w:r>
+        <w:rPr>
+          <w:rFonts w:ascii="Calibri" w:hAnsi="Calibri" w:cs="Calibri"/>
+        </w:rPr>
+        <w:br/>
+      </w:r>
+    </w:p>
+    <w:p>
+      <w:pPr>
+        <w:rPr>
+          <w:rFonts w:ascii="Calibri" w:hAnsi="Calibri" w:cs="Calibri"/>
+        </w:rPr>
+      </w:pPr>
+      <w:r>
+        <w:rPr>
+          <w:rFonts w:ascii="Calibri" w:hAnsi="Calibri" w:cs="Calibri"/>
+        </w:rPr>
+        <w:t>END R Example</w:t>
+      </w:r>
     </w:p>
     <w:p>
       <w:pPr>
@@ -1407,6 +1678,7 @@
         <w:rPr>
           <w:rFonts w:ascii="Calibri" w:hAnsi="Calibri" w:cs="Calibri"/>
         </w:rPr>
+        <w:lastRenderedPageBreak/>
         <w:t>Image :</w:t>
       </w:r>
       <w:proofErr w:type="gramEnd"/>
@@ -1837,6 +2109,7 @@
         <w:rPr>
           <w:rFonts w:ascii="Calibri" w:hAnsi="Calibri" w:cs="Calibri"/>
         </w:rPr>
+        <w:lastRenderedPageBreak/>
         <w:t>Further Reading</w:t>
       </w:r>
     </w:p>

</xml_diff>